<commit_message>
docs: correct stale 70XXX→24XXX host-port + herald-→ container-prefix facts (CLAUDE.md + COMMONS.md)
The COMMONS_INFRA nano-detail guide subagent caught that CLAUDE.md's 'all host ports start with 70XXX' is stale — the committed quickstart compose + commons/branding.go use the 24XXX range (Postgres 24100, Redis 24200, OTel 24417/24418, flavor serve 24791/24793), and container names are herald-prefixed (herald-postgres). Corrected CLAUDE.md §'Project conventions' (r20→21, gate 15/15) + the one COMMONS.md DefaultPort gloss that copied the wrong 70XXX range. Verified against quickstart/docker-compose.quickstart.yml + commons/branding.go + the e2e :24100 PG reference. (Archived V1 spec's 70XXX left as frozen history; COMMONS_INFRA.md already documents the 24XXX truth + flags the discrepancy.)

Co-Authored-By: Claude Opus 4.8 <noreply@anthropic.com>
</commit_message>
<xml_diff>
--- a/CLAUDE.docx
+++ b/CLAUDE.docx
@@ -75,7 +75,7 @@
               <w:pStyle w:val="Compact"/>
             </w:pPr>
             <w:r>
-              <w:t xml:space="preserve">20</w:t>
+              <w:t xml:space="preserve">21</w:t>
             </w:r>
           </w:p>
         </w:tc>
@@ -175,7 +175,161 @@
                 <w:b/>
                 <w:bCs/>
               </w:rPr>
-              <w:t xml:space="preserve">r20: refreshed the stale "first-implementation cycle r1 (2026-05-20) / Go-scaffold landed" project-status prose to current reality —</w:t>
+              <w:t xml:space="preserve">r21: corrected the stale container-stack facts in §"Project conventions" — host ports are the</w:t>
+            </w:r>
+            <w:r>
+              <w:rPr>
+                <w:b/>
+                <w:bCs/>
+              </w:rPr>
+              <w:t xml:space="preserve"> </w:t>
+            </w:r>
+            <w:r>
+              <w:rPr>
+                <w:b/>
+                <w:b/>
+                <w:bCs/>
+                <w:bCs/>
+              </w:rPr>
+              <w:t xml:space="preserve">24XXX</w:t>
+            </w:r>
+            <w:r>
+              <w:rPr>
+                <w:b/>
+                <w:bCs/>
+              </w:rPr>
+              <w:t xml:space="preserve"> </w:t>
+            </w:r>
+            <w:r>
+              <w:rPr>
+                <w:b/>
+                <w:bCs/>
+              </w:rPr>
+              <w:t xml:space="preserve">reserved range (Postgres 24100 / Redis 24200 / OTel 24417-24418 / flavor serve ports 24791/24793 per</w:t>
+            </w:r>
+            <w:r>
+              <w:rPr>
+                <w:b/>
+                <w:bCs/>
+              </w:rPr>
+              <w:t xml:space="preserve"> </w:t>
+            </w:r>
+            <w:r>
+              <w:rPr>
+                <w:rStyle w:val="VerbatimChar"/>
+                <w:b/>
+                <w:bCs/>
+              </w:rPr>
+              <w:t xml:space="preserve">commons/branding.go</w:t>
+            </w:r>
+            <w:r>
+              <w:rPr>
+                <w:b/>
+                <w:bCs/>
+              </w:rPr>
+              <w:t xml:space="preserve">), NOT "70XXX"; container names are</w:t>
+            </w:r>
+            <w:r>
+              <w:rPr>
+                <w:b/>
+                <w:bCs/>
+              </w:rPr>
+              <w:t xml:space="preserve"> </w:t>
+            </w:r>
+            <w:r>
+              <w:rPr>
+                <w:rStyle w:val="VerbatimChar"/>
+                <w:b/>
+                <w:bCs/>
+              </w:rPr>
+              <w:t xml:space="preserve">herald-</w:t>
+            </w:r>
+            <w:r>
+              <w:rPr>
+                <w:b/>
+                <w:bCs/>
+              </w:rPr>
+              <w:t xml:space="preserve">-prefixed (</w:t>
+            </w:r>
+            <w:r>
+              <w:rPr>
+                <w:rStyle w:val="VerbatimChar"/>
+                <w:b/>
+                <w:bCs/>
+              </w:rPr>
+              <w:t xml:space="preserve">herald-postgres</w:t>
+            </w:r>
+            <w:r>
+              <w:rPr>
+                <w:b/>
+                <w:bCs/>
+              </w:rPr>
+              <w:t xml:space="preserve"> </w:t>
+            </w:r>
+            <w:r>
+              <w:rPr>
+                <w:b/>
+                <w:bCs/>
+              </w:rPr>
+              <w:t xml:space="preserve">etc.), not bare</w:t>
+            </w:r>
+            <w:r>
+              <w:rPr>
+                <w:b/>
+                <w:bCs/>
+              </w:rPr>
+              <w:t xml:space="preserve"> </w:t>
+            </w:r>
+            <w:r>
+              <w:rPr>
+                <w:rStyle w:val="VerbatimChar"/>
+                <w:b/>
+                <w:bCs/>
+              </w:rPr>
+              <w:t xml:space="preserve">herald</w:t>
+            </w:r>
+            <w:r>
+              <w:rPr>
+                <w:b/>
+                <w:bCs/>
+              </w:rPr>
+              <w:t xml:space="preserve"> </w:t>
+            </w:r>
+            <w:r>
+              <w:rPr>
+                <w:b/>
+                <w:bCs/>
+              </w:rPr>
+              <w:t xml:space="preserve">— verified against the committed</w:t>
+            </w:r>
+            <w:r>
+              <w:rPr>
+                <w:b/>
+                <w:bCs/>
+              </w:rPr>
+              <w:t xml:space="preserve"> </w:t>
+            </w:r>
+            <w:r>
+              <w:rPr>
+                <w:rStyle w:val="VerbatimChar"/>
+                <w:b/>
+                <w:bCs/>
+              </w:rPr>
+              <w:t xml:space="preserve">quickstart/docker-compose.quickstart.yml</w:t>
+            </w:r>
+            <w:r>
+              <w:rPr>
+                <w:b/>
+                <w:bCs/>
+              </w:rPr>
+              <w:t xml:space="preserve"> </w:t>
+            </w:r>
+            <w:r>
+              <w:rPr>
+                <w:b/>
+                <w:bCs/>
+              </w:rPr>
+              <w:t xml:space="preserve">+ the e2e :24100 PG reference (surfaced by the COMMONS_INFRA nano-detail guide subagent). Prior r20: refreshed the stale "first-implementation cycle r1 (2026-05-20) / Go-scaffold landed" project-status prose to current reality —</w:t>
             </w:r>
             <w:r>
               <w:rPr>
@@ -9564,34 +9718,198 @@
         <w:t xml:space="preserve">https://github.com/vasic-digital/containers</w:t>
       </w:r>
       <w:r>
-        <w:t xml:space="preserve">). All container names start with</w:t>
-      </w:r>
-      <w:r>
-        <w:t xml:space="preserve"> </w:t>
-      </w:r>
-      <w:r>
-        <w:rPr>
-          <w:rStyle w:val="VerbatimChar"/>
-        </w:rPr>
-        <w:t xml:space="preserve">herald</w:t>
-      </w:r>
-      <w:r>
-        <w:t xml:space="preserve">; all host ports start with</w:t>
-      </w:r>
-      <w:r>
-        <w:t xml:space="preserve"> </w:t>
-      </w:r>
-      <w:r>
-        <w:rPr>
-          <w:rStyle w:val="VerbatimChar"/>
-        </w:rPr>
-        <w:t xml:space="preserve">70XXX</w:t>
-      </w:r>
-      <w:r>
-        <w:t xml:space="preserve"> </w:t>
-      </w:r>
-      <w:r>
-        <w:t xml:space="preserve">(70001, 70002, …) to avoid collisions.</w:t>
+        <w:t xml:space="preserve">). All container names are</w:t>
+      </w:r>
+      <w:r>
+        <w:t xml:space="preserve"> </w:t>
+      </w:r>
+      <w:r>
+        <w:rPr>
+          <w:rStyle w:val="VerbatimChar"/>
+        </w:rPr>
+        <w:t xml:space="preserve">herald-</w:t>
+      </w:r>
+      <w:r>
+        <w:t xml:space="preserve">-prefixed (</w:t>
+      </w:r>
+      <w:r>
+        <w:rPr>
+          <w:rStyle w:val="VerbatimChar"/>
+        </w:rPr>
+        <w:t xml:space="preserve">herald-postgres</w:t>
+      </w:r>
+      <w:r>
+        <w:t xml:space="preserve">,</w:t>
+      </w:r>
+      <w:r>
+        <w:t xml:space="preserve"> </w:t>
+      </w:r>
+      <w:r>
+        <w:rPr>
+          <w:rStyle w:val="VerbatimChar"/>
+        </w:rPr>
+        <w:t xml:space="preserve">herald-redis</w:t>
+      </w:r>
+      <w:r>
+        <w:t xml:space="preserve">,</w:t>
+      </w:r>
+      <w:r>
+        <w:t xml:space="preserve"> </w:t>
+      </w:r>
+      <w:r>
+        <w:rPr>
+          <w:rStyle w:val="VerbatimChar"/>
+        </w:rPr>
+        <w:t xml:space="preserve">herald-otel</w:t>
+      </w:r>
+      <w:r>
+        <w:t xml:space="preserve">,</w:t>
+      </w:r>
+      <w:r>
+        <w:t xml:space="preserve"> </w:t>
+      </w:r>
+      <w:r>
+        <w:rPr>
+          <w:rStyle w:val="VerbatimChar"/>
+        </w:rPr>
+        <w:t xml:space="preserve">herald-pherald</w:t>
+      </w:r>
+      <w:r>
+        <w:t xml:space="preserve">); all host ports are in the</w:t>
+      </w:r>
+      <w:r>
+        <w:t xml:space="preserve"> </w:t>
+      </w:r>
+      <w:r>
+        <w:rPr>
+          <w:rStyle w:val="VerbatimChar"/>
+          <w:b/>
+          <w:bCs/>
+        </w:rPr>
+        <w:t xml:space="preserve">24XXX</w:t>
+      </w:r>
+      <w:r>
+        <w:t xml:space="preserve"> </w:t>
+      </w:r>
+      <w:r>
+        <w:t xml:space="preserve">reserved range — Postgres</w:t>
+      </w:r>
+      <w:r>
+        <w:t xml:space="preserve"> </w:t>
+      </w:r>
+      <w:r>
+        <w:rPr>
+          <w:rStyle w:val="VerbatimChar"/>
+        </w:rPr>
+        <w:t xml:space="preserve">24100</w:t>
+      </w:r>
+      <w:r>
+        <w:t xml:space="preserve">, Redis</w:t>
+      </w:r>
+      <w:r>
+        <w:t xml:space="preserve"> </w:t>
+      </w:r>
+      <w:r>
+        <w:rPr>
+          <w:rStyle w:val="VerbatimChar"/>
+        </w:rPr>
+        <w:t xml:space="preserve">24200</w:t>
+      </w:r>
+      <w:r>
+        <w:t xml:space="preserve">, OTel</w:t>
+      </w:r>
+      <w:r>
+        <w:t xml:space="preserve"> </w:t>
+      </w:r>
+      <w:r>
+        <w:rPr>
+          <w:rStyle w:val="VerbatimChar"/>
+        </w:rPr>
+        <w:t xml:space="preserve">24417</w:t>
+      </w:r>
+      <w:r>
+        <w:t xml:space="preserve">/</w:t>
+      </w:r>
+      <w:r>
+        <w:rPr>
+          <w:rStyle w:val="VerbatimChar"/>
+        </w:rPr>
+        <w:t xml:space="preserve">24418</w:t>
+      </w:r>
+      <w:r>
+        <w:t xml:space="preserve">, and the per-flavor serve ports from</w:t>
+      </w:r>
+      <w:r>
+        <w:t xml:space="preserve"> </w:t>
+      </w:r>
+      <w:r>
+        <w:rPr>
+          <w:rStyle w:val="VerbatimChar"/>
+        </w:rPr>
+        <w:t xml:space="preserve">commons/branding.go</w:t>
+      </w:r>
+      <w:r>
+        <w:t xml:space="preserve"> </w:t>
+      </w:r>
+      <w:r>
+        <w:t xml:space="preserve">(</w:t>
+      </w:r>
+      <w:r>
+        <w:rPr>
+          <w:rStyle w:val="VerbatimChar"/>
+        </w:rPr>
+        <w:t xml:space="preserve">pherald</w:t>
+      </w:r>
+      <w:r>
+        <w:t xml:space="preserve"> </w:t>
+      </w:r>
+      <w:r>
+        <w:t xml:space="preserve">24791,</w:t>
+      </w:r>
+      <w:r>
+        <w:t xml:space="preserve"> </w:t>
+      </w:r>
+      <w:r>
+        <w:rPr>
+          <w:rStyle w:val="VerbatimChar"/>
+        </w:rPr>
+        <w:t xml:space="preserve">sherald</w:t>
+      </w:r>
+      <w:r>
+        <w:t xml:space="preserve"> </w:t>
+      </w:r>
+      <w:r>
+        <w:t xml:space="preserve">24793, …) — to avoid collisions. (An earlier "70XXX" framing is stale; the committed</w:t>
+      </w:r>
+      <w:r>
+        <w:t xml:space="preserve"> </w:t>
+      </w:r>
+      <w:r>
+        <w:rPr>
+          <w:rStyle w:val="VerbatimChar"/>
+        </w:rPr>
+        <w:t xml:space="preserve">quickstart/docker-compose.quickstart.yml</w:t>
+      </w:r>
+      <w:r>
+        <w:t xml:space="preserve"> </w:t>
+      </w:r>
+      <w:r>
+        <w:t xml:space="preserve">+</w:t>
+      </w:r>
+      <w:r>
+        <w:t xml:space="preserve"> </w:t>
+      </w:r>
+      <w:r>
+        <w:rPr>
+          <w:rStyle w:val="VerbatimChar"/>
+        </w:rPr>
+        <w:t xml:space="preserve">commons/branding.go</w:t>
+      </w:r>
+      <w:r>
+        <w:t xml:space="preserve"> </w:t>
+      </w:r>
+      <w:r>
+        <w:t xml:space="preserve">use 24XXX.)</w:t>
       </w:r>
     </w:p>
     <w:p>

</xml_diff>

<commit_message>
docs(claude): document docs_chain as the routine doc-sync flow; verify=E148 §11.4.106 drift-gate (r22)
docs_chain is now installed (~/.local/bin/docs_chain @ digital.vasic.docs_chain
02eb81b). 'Documentation artefacts' section now documents docs_chain sync/verify/
doctor as the canonical flow (export_docs.sh remains a fallback whose docx/pdf can
drift STALE — prefer docs_chain sync then confirm verify in-sync before commit).
CLAUDE.md r21->r22; siblings regenerated via docs_chain sync (verify in-sync).

Co-Authored-By: Claude Opus 4.8 <noreply@anthropic.com>
</commit_message>
<xml_diff>
--- a/CLAUDE.docx
+++ b/CLAUDE.docx
@@ -75,7 +75,7 @@
               <w:pStyle w:val="Compact"/>
             </w:pPr>
             <w:r>
-              <w:t xml:space="preserve">21</w:t>
+              <w:t xml:space="preserve">22</w:t>
             </w:r>
           </w:p>
         </w:tc>
@@ -123,7 +123,7 @@
               <w:pStyle w:val="Compact"/>
             </w:pPr>
             <w:r>
-              <w:t xml:space="preserve">2026-05-31</w:t>
+              <w:t xml:space="preserve">2026-06-02</w:t>
             </w:r>
           </w:p>
         </w:tc>
@@ -175,7 +175,334 @@
                 <w:b/>
                 <w:bCs/>
               </w:rPr>
-              <w:t xml:space="preserve">r21: corrected the stale container-stack facts in §"Project conventions" — host ports are the</w:t>
+              <w:t xml:space="preserve">r22: documented</w:t>
+            </w:r>
+            <w:r>
+              <w:rPr>
+                <w:b/>
+                <w:bCs/>
+              </w:rPr>
+              <w:t xml:space="preserve"> </w:t>
+            </w:r>
+            <w:r>
+              <w:rPr>
+                <w:rStyle w:val="VerbatimChar"/>
+                <w:b/>
+                <w:bCs/>
+              </w:rPr>
+              <w:t xml:space="preserve">docs_chain</w:t>
+            </w:r>
+            <w:r>
+              <w:rPr>
+                <w:b/>
+                <w:bCs/>
+              </w:rPr>
+              <w:t xml:space="preserve"> </w:t>
+            </w:r>
+            <w:r>
+              <w:rPr>
+                <w:b/>
+                <w:bCs/>
+              </w:rPr>
+              <w:t xml:space="preserve">as the canonical routine doc-sync flow in §"Documentation artefacts (PDF/HTML siblings)" — the engine is now INSTALLED on PATH (</w:t>
+            </w:r>
+            <w:r>
+              <w:rPr>
+                <w:rStyle w:val="VerbatimChar"/>
+                <w:b/>
+                <w:bCs/>
+              </w:rPr>
+              <w:t xml:space="preserve">~/.local/bin/docs_chain</w:t>
+            </w:r>
+            <w:r>
+              <w:rPr>
+                <w:b/>
+                <w:bCs/>
+              </w:rPr>
+              <w:t xml:space="preserve">, built from</w:t>
+            </w:r>
+            <w:r>
+              <w:rPr>
+                <w:b/>
+                <w:bCs/>
+              </w:rPr>
+              <w:t xml:space="preserve"> </w:t>
+            </w:r>
+            <w:r>
+              <w:rPr>
+                <w:rStyle w:val="VerbatimChar"/>
+                <w:b/>
+                <w:bCs/>
+              </w:rPr>
+              <w:t xml:space="preserve">digital.vasic.docs_chain</w:t>
+            </w:r>
+            <w:r>
+              <w:rPr>
+                <w:b/>
+                <w:bCs/>
+              </w:rPr>
+              <w:t xml:space="preserve"> </w:t>
+            </w:r>
+            <w:r>
+              <w:rPr>
+                <w:b/>
+                <w:bCs/>
+              </w:rPr>
+              <w:t xml:space="preserve">@</w:t>
+            </w:r>
+            <w:r>
+              <w:rPr>
+                <w:b/>
+                <w:bCs/>
+              </w:rPr>
+              <w:t xml:space="preserve"> </w:t>
+            </w:r>
+            <w:r>
+              <w:rPr>
+                <w:rStyle w:val="VerbatimChar"/>
+                <w:b/>
+                <w:bCs/>
+              </w:rPr>
+              <w:t xml:space="preserve">02eb81b</w:t>
+            </w:r>
+            <w:r>
+              <w:rPr>
+                <w:b/>
+                <w:bCs/>
+              </w:rPr>
+              <w:t xml:space="preserve">); commands</w:t>
+            </w:r>
+            <w:r>
+              <w:rPr>
+                <w:b/>
+                <w:bCs/>
+              </w:rPr>
+              <w:t xml:space="preserve"> </w:t>
+            </w:r>
+            <w:r>
+              <w:rPr>
+                <w:rStyle w:val="VerbatimChar"/>
+                <w:b/>
+                <w:bCs/>
+              </w:rPr>
+              <w:t xml:space="preserve">docs_chain sync herald-docs</w:t>
+            </w:r>
+            <w:r>
+              <w:rPr>
+                <w:b/>
+                <w:bCs/>
+              </w:rPr>
+              <w:t xml:space="preserve"> </w:t>
+            </w:r>
+            <w:r>
+              <w:rPr>
+                <w:b/>
+                <w:bCs/>
+              </w:rPr>
+              <w:t xml:space="preserve">(regenerate html/pdf/docx siblings),</w:t>
+            </w:r>
+            <w:r>
+              <w:rPr>
+                <w:b/>
+                <w:bCs/>
+              </w:rPr>
+              <w:t xml:space="preserve"> </w:t>
+            </w:r>
+            <w:r>
+              <w:rPr>
+                <w:rStyle w:val="VerbatimChar"/>
+                <w:b/>
+                <w:bCs/>
+              </w:rPr>
+              <w:t xml:space="preserve">docs_chain verify herald-docs</w:t>
+            </w:r>
+            <w:r>
+              <w:rPr>
+                <w:b/>
+                <w:bCs/>
+              </w:rPr>
+              <w:t xml:space="preserve"> </w:t>
+            </w:r>
+            <w:r>
+              <w:rPr>
+                <w:b/>
+                <w:bCs/>
+              </w:rPr>
+              <w:t xml:space="preserve">(= e2e invariant E146, the §11.4.106 drift-gate; assert</w:t>
+            </w:r>
+            <w:r>
+              <w:rPr>
+                <w:b/>
+                <w:bCs/>
+              </w:rPr>
+              <w:t xml:space="preserve"> </w:t>
+            </w:r>
+            <w:r>
+              <w:rPr>
+                <w:rStyle w:val="VerbatimChar"/>
+                <w:b/>
+                <w:bCs/>
+              </w:rPr>
+              <w:t xml:space="preserve">in-sync</w:t>
+            </w:r>
+            <w:r>
+              <w:rPr>
+                <w:b/>
+                <w:bCs/>
+              </w:rPr>
+              <w:t xml:space="preserve"> </w:t>
+            </w:r>
+            <w:r>
+              <w:rPr>
+                <w:b/>
+                <w:bCs/>
+              </w:rPr>
+              <w:t xml:space="preserve">before committing),</w:t>
+            </w:r>
+            <w:r>
+              <w:rPr>
+                <w:b/>
+                <w:bCs/>
+              </w:rPr>
+              <w:t xml:space="preserve"> </w:t>
+            </w:r>
+            <w:r>
+              <w:rPr>
+                <w:rStyle w:val="VerbatimChar"/>
+                <w:b/>
+                <w:bCs/>
+              </w:rPr>
+              <w:t xml:space="preserve">docs_chain doctor herald-docs</w:t>
+            </w:r>
+            <w:r>
+              <w:rPr>
+                <w:b/>
+                <w:bCs/>
+              </w:rPr>
+              <w:t xml:space="preserve"> </w:t>
+            </w:r>
+            <w:r>
+              <w:rPr>
+                <w:b/>
+                <w:bCs/>
+              </w:rPr>
+              <w:t xml:space="preserve">(validate the 263-node/197-edge context graph + transform-tool presence); context config</w:t>
+            </w:r>
+            <w:r>
+              <w:rPr>
+                <w:b/>
+                <w:bCs/>
+              </w:rPr>
+              <w:t xml:space="preserve"> </w:t>
+            </w:r>
+            <w:r>
+              <w:rPr>
+                <w:rStyle w:val="VerbatimChar"/>
+                <w:b/>
+                <w:bCs/>
+              </w:rPr>
+              <w:t xml:space="preserve">.docs_chain/contexts/herald-docs.yaml</w:t>
+            </w:r>
+            <w:r>
+              <w:rPr>
+                <w:b/>
+                <w:bCs/>
+              </w:rPr>
+              <w:t xml:space="preserve"> </w:t>
+            </w:r>
+            <w:r>
+              <w:rPr>
+                <w:b/>
+                <w:bCs/>
+              </w:rPr>
+              <w:t xml:space="preserve">is generated by</w:t>
+            </w:r>
+            <w:r>
+              <w:rPr>
+                <w:b/>
+                <w:bCs/>
+              </w:rPr>
+              <w:t xml:space="preserve"> </w:t>
+            </w:r>
+            <w:r>
+              <w:rPr>
+                <w:rStyle w:val="VerbatimChar"/>
+                <w:b/>
+                <w:bCs/>
+              </w:rPr>
+              <w:t xml:space="preserve">scripts/docs_chain/gen_context.py</w:t>
+            </w:r>
+            <w:r>
+              <w:rPr>
+                <w:b/>
+                <w:bCs/>
+              </w:rPr>
+              <w:t xml:space="preserve"> </w:t>
+            </w:r>
+            <w:r>
+              <w:rPr>
+                <w:b/>
+                <w:bCs/>
+              </w:rPr>
+              <w:t xml:space="preserve">(do not hand-edit); captured the staleness lesson (export_docs.sh docx/pdf can drift STALE vs docs_chain canonical output — PREFER</w:t>
+            </w:r>
+            <w:r>
+              <w:rPr>
+                <w:b/>
+                <w:bCs/>
+              </w:rPr>
+              <w:t xml:space="preserve"> </w:t>
+            </w:r>
+            <w:r>
+              <w:rPr>
+                <w:rStyle w:val="VerbatimChar"/>
+                <w:b/>
+                <w:bCs/>
+              </w:rPr>
+              <w:t xml:space="preserve">docs_chain sync</w:t>
+            </w:r>
+            <w:r>
+              <w:rPr>
+                <w:b/>
+                <w:bCs/>
+              </w:rPr>
+              <w:t xml:space="preserve"> </w:t>
+            </w:r>
+            <w:r>
+              <w:rPr>
+                <w:b/>
+                <w:bCs/>
+              </w:rPr>
+              <w:t xml:space="preserve">after editing tracked docs);</w:t>
+            </w:r>
+            <w:r>
+              <w:rPr>
+                <w:b/>
+                <w:bCs/>
+              </w:rPr>
+              <w:t xml:space="preserve"> </w:t>
+            </w:r>
+            <w:r>
+              <w:rPr>
+                <w:rStyle w:val="VerbatimChar"/>
+                <w:b/>
+                <w:bCs/>
+              </w:rPr>
+              <w:t xml:space="preserve">scripts/export_docs.sh</w:t>
+            </w:r>
+            <w:r>
+              <w:rPr>
+                <w:b/>
+                <w:bCs/>
+              </w:rPr>
+              <w:t xml:space="preserve"> </w:t>
+            </w:r>
+            <w:r>
+              <w:rPr>
+                <w:b/>
+                <w:bCs/>
+              </w:rPr>
+              <w:t xml:space="preserve">retained as fallback; logo-injection note intact. Prior r21: corrected the stale container-stack facts in §"Project conventions" — host ports are the</w:t>
             </w:r>
             <w:r>
               <w:rPr>
@@ -1257,7 +1584,7 @@
               <w:pStyle w:val="Compact"/>
             </w:pPr>
             <w:r>
-              <w:t xml:space="preserve">spec-path references (r2), pre-implementation-language update (r3), submodules + HRD-docs + codegraph-index enumeration (r4), §107 mandate restatement + I8a anchor (r5), Wave-2/3a workspace-module-count refresh (r7), Wave 4a + 4b status pointer + e2e/mutation tally refresh (r8), Wave 5 T1 qaherald skeleton + commons_tls enumeration fold-in (r9), Wave 6 inbound runtime + CC headless bridge code-doc closure (r10), Helix §11.4.85 + §11.4.87 + §11.4.88 propagation (r11), Helix §11.4.89–§11.4.94 propagation (r12), Helix §11.4.95–§11.4.97 propagation (r13)</w:t>
+              <w:t xml:space="preserve">spec-path references (r2), pre-implementation-language update (r3), submodules + HRD-docs + codegraph-index enumeration (r4), §107 mandate restatement + I8a anchor (r5), Wave-2/3a workspace-module-count refresh (r7), Wave 4a + 4b status pointer + e2e/mutation tally refresh (r8), Wave 5 T1 qaherald skeleton + commons_tls enumeration fold-in (r9), Wave 6 inbound runtime + CC headless bridge code-doc closure (r10), Helix §11.4.85 + §11.4.87 + §11.4.88 propagation (r11), Helix §11.4.89–§11.4.94 propagation (r12), Helix §11.4.95–§11.4.97 propagation (r13), docs_chain documented as routine doc-sync flow (r22)</w:t>
             </w:r>
           </w:p>
         </w:tc>
@@ -1575,7 +1902,136 @@
               <w:t xml:space="preserve">11.4.97</w:t>
             </w:r>
             <w:r>
-              <w:t xml:space="preserve">, inherited per §11.4.35; restated + cited, not redefined.</w:t>
+              <w:t xml:space="preserve">, inherited per §11.4.35; restated + cited, not redefined; r22 rewrites §"Documentation artefacts (PDF/HTML siblings)" to make</w:t>
+            </w:r>
+            <w:r>
+              <w:t xml:space="preserve"> </w:t>
+            </w:r>
+            <w:r>
+              <w:rPr>
+                <w:rStyle w:val="VerbatimChar"/>
+              </w:rPr>
+              <w:t xml:space="preserve">docs_chain</w:t>
+            </w:r>
+            <w:r>
+              <w:t xml:space="preserve"> </w:t>
+            </w:r>
+            <w:r>
+              <w:t xml:space="preserve">(installed on PATH at</w:t>
+            </w:r>
+            <w:r>
+              <w:t xml:space="preserve"> </w:t>
+            </w:r>
+            <w:r>
+              <w:rPr>
+                <w:rStyle w:val="VerbatimChar"/>
+              </w:rPr>
+              <w:t xml:space="preserve">~/.local/bin/docs_chain</w:t>
+            </w:r>
+            <w:r>
+              <w:t xml:space="preserve">, built @</w:t>
+            </w:r>
+            <w:r>
+              <w:t xml:space="preserve"> </w:t>
+            </w:r>
+            <w:r>
+              <w:rPr>
+                <w:rStyle w:val="VerbatimChar"/>
+              </w:rPr>
+              <w:t xml:space="preserve">02eb81b</w:t>
+            </w:r>
+            <w:r>
+              <w:t xml:space="preserve">) the documented routine doc-sync flow —</w:t>
+            </w:r>
+            <w:r>
+              <w:t xml:space="preserve"> </w:t>
+            </w:r>
+            <w:r>
+              <w:rPr>
+                <w:rStyle w:val="VerbatimChar"/>
+              </w:rPr>
+              <w:t xml:space="preserve">sync</w:t>
+            </w:r>
+            <w:r>
+              <w:t xml:space="preserve">/</w:t>
+            </w:r>
+            <w:r>
+              <w:rPr>
+                <w:rStyle w:val="VerbatimChar"/>
+              </w:rPr>
+              <w:t xml:space="preserve">verify</w:t>
+            </w:r>
+            <w:r>
+              <w:t xml:space="preserve">(=E146 §11.4.106 drift-gate)/</w:t>
+            </w:r>
+            <w:r>
+              <w:rPr>
+                <w:rStyle w:val="VerbatimChar"/>
+              </w:rPr>
+              <w:t xml:space="preserve">doctor herald-docs</w:t>
+            </w:r>
+            <w:r>
+              <w:t xml:space="preserve">, context</w:t>
+            </w:r>
+            <w:r>
+              <w:t xml:space="preserve"> </w:t>
+            </w:r>
+            <w:r>
+              <w:rPr>
+                <w:rStyle w:val="VerbatimChar"/>
+              </w:rPr>
+              <w:t xml:space="preserve">.docs_chain/contexts/herald-docs.yaml</w:t>
+            </w:r>
+            <w:r>
+              <w:t xml:space="preserve"> </w:t>
+            </w:r>
+            <w:r>
+              <w:t xml:space="preserve">(generated, not hand-edited) — with</w:t>
+            </w:r>
+            <w:r>
+              <w:t xml:space="preserve"> </w:t>
+            </w:r>
+            <w:r>
+              <w:rPr>
+                <w:rStyle w:val="VerbatimChar"/>
+              </w:rPr>
+              <w:t xml:space="preserve">scripts/export_docs.sh</w:t>
+            </w:r>
+            <w:r>
+              <w:t xml:space="preserve"> </w:t>
+            </w:r>
+            <w:r>
+              <w:t xml:space="preserve">kept as fallback and the staleness lesson (export_docs docx/pdf can drift STALE vs docs_chain canonical; PREFER</w:t>
+            </w:r>
+            <w:r>
+              <w:t xml:space="preserve"> </w:t>
+            </w:r>
+            <w:r>
+              <w:rPr>
+                <w:rStyle w:val="VerbatimChar"/>
+              </w:rPr>
+              <w:t xml:space="preserve">docs_chain sync</w:t>
+            </w:r>
+            <w:r>
+              <w:t xml:space="preserve"> </w:t>
+            </w:r>
+            <w:r>
+              <w:t xml:space="preserve">+ confirm</w:t>
+            </w:r>
+            <w:r>
+              <w:t xml:space="preserve"> </w:t>
+            </w:r>
+            <w:r>
+              <w:rPr>
+                <w:rStyle w:val="VerbatimChar"/>
+              </w:rPr>
+              <w:t xml:space="preserve">verify</w:t>
+            </w:r>
+            <w:r>
+              <w:t xml:space="preserve"> </w:t>
+            </w:r>
+            <w:r>
+              <w:t xml:space="preserve">in-sync before commit) captured; logo-injection note intact.</w:t>
             </w:r>
           </w:p>
         </w:tc>
@@ -10443,55 +10899,135 @@
           <w:b/>
           <w:bCs/>
         </w:rPr>
-        <w:t xml:space="preserve">Logo branding (added 2026-05-21).</w:t>
-      </w:r>
-      <w:r>
-        <w:t xml:space="preserve"> </w:t>
-      </w:r>
-      <w:r>
-        <w:t xml:space="preserve">Every tracked Markdown doc now leads with a centered Herald logo header (pandoc-friendly</w:t>
-      </w:r>
-      <w:r>
-        <w:t xml:space="preserve"> </w:t>
-      </w:r>
-      <w:r>
-        <w:rPr>
-          <w:rStyle w:val="VerbatimChar"/>
-        </w:rPr>
-        <w:t xml:space="preserve">&lt;div align="center"&gt;</w:t>
-      </w:r>
-      <w:r>
-        <w:t xml:space="preserve"> </w:t>
-      </w:r>
-      <w:r>
-        <w:t xml:space="preserve">wrapping a</w:t>
-      </w:r>
-      <w:r>
-        <w:t xml:space="preserve"> </w:t>
-      </w:r>
-      <w:r>
-        <w:rPr>
-          <w:rStyle w:val="VerbatimChar"/>
-        </w:rPr>
-        <w:t xml:space="preserve">&lt;img src="..." alt="Herald" width="96" height="96" /&gt;</w:t>
-      </w:r>
-      <w:r>
-        <w:t xml:space="preserve"> </w:t>
-      </w:r>
-      <w:r>
-        <w:t xml:space="preserve">image reference to</w:t>
-      </w:r>
-      <w:r>
-        <w:t xml:space="preserve"> </w:t>
-      </w:r>
-      <w:r>
-        <w:rPr>
-          <w:rStyle w:val="VerbatimChar"/>
-        </w:rPr>
-        <w:t xml:space="preserve">assets/logo/herald_logo_square_128.png</w:t>
-      </w:r>
-      <w:r>
-        <w:t xml:space="preserve">). The export pipeline propagates that logo into the HTML, PDF, and DOCX siblings:</w:t>
+        <w:t xml:space="preserve">Routine doc-sync flow —</w:t>
+      </w:r>
+      <w:r>
+        <w:rPr>
+          <w:b/>
+          <w:bCs/>
+        </w:rPr>
+        <w:t xml:space="preserve"> </w:t>
+      </w:r>
+      <w:r>
+        <w:rPr>
+          <w:rStyle w:val="VerbatimChar"/>
+          <w:b/>
+          <w:bCs/>
+        </w:rPr>
+        <w:t xml:space="preserve">docs_chain</w:t>
+      </w:r>
+      <w:r>
+        <w:rPr>
+          <w:b/>
+          <w:bCs/>
+        </w:rPr>
+        <w:t xml:space="preserve"> </w:t>
+      </w:r>
+      <w:r>
+        <w:rPr>
+          <w:b/>
+          <w:bCs/>
+        </w:rPr>
+        <w:t xml:space="preserve">(canonical as of 2026-06-02).</w:t>
+      </w:r>
+      <w:r>
+        <w:t xml:space="preserve"> </w:t>
+      </w:r>
+      <w:r>
+        <w:t xml:space="preserve">The</w:t>
+      </w:r>
+      <w:r>
+        <w:t xml:space="preserve"> </w:t>
+      </w:r>
+      <w:r>
+        <w:rPr>
+          <w:rStyle w:val="VerbatimChar"/>
+        </w:rPr>
+        <w:t xml:space="preserve">docs_chain</w:t>
+      </w:r>
+      <w:r>
+        <w:t xml:space="preserve"> </w:t>
+      </w:r>
+      <w:r>
+        <w:t xml:space="preserve">engine (</w:t>
+      </w:r>
+      <w:r>
+        <w:rPr>
+          <w:rStyle w:val="VerbatimChar"/>
+        </w:rPr>
+        <w:t xml:space="preserve">digital.vasic.docs_chain</w:t>
+      </w:r>
+      <w:r>
+        <w:t xml:space="preserve">, built @ commit</w:t>
+      </w:r>
+      <w:r>
+        <w:t xml:space="preserve"> </w:t>
+      </w:r>
+      <w:r>
+        <w:rPr>
+          <w:rStyle w:val="VerbatimChar"/>
+        </w:rPr>
+        <w:t xml:space="preserve">02eb81b</w:t>
+      </w:r>
+      <w:r>
+        <w:t xml:space="preserve">) is INSTALLED on PATH at</w:t>
+      </w:r>
+      <w:r>
+        <w:t xml:space="preserve"> </w:t>
+      </w:r>
+      <w:r>
+        <w:rPr>
+          <w:rStyle w:val="VerbatimChar"/>
+        </w:rPr>
+        <w:t xml:space="preserve">~/.local/bin/docs_chain</w:t>
+      </w:r>
+      <w:r>
+        <w:t xml:space="preserve"> </w:t>
+      </w:r>
+      <w:r>
+        <w:t xml:space="preserve">and is now the canonical documentation-sync flow (the §11.4.106 mechanization). After editing any tracked</w:t>
+      </w:r>
+      <w:r>
+        <w:t xml:space="preserve"> </w:t>
+      </w:r>
+      <w:r>
+        <w:rPr>
+          <w:rStyle w:val="VerbatimChar"/>
+        </w:rPr>
+        <w:t xml:space="preserve">.md</w:t>
+      </w:r>
+      <w:r>
+        <w:t xml:space="preserve">, regenerate its siblings with</w:t>
+      </w:r>
+      <w:r>
+        <w:t xml:space="preserve"> </w:t>
+      </w:r>
+      <w:r>
+        <w:rPr>
+          <w:rStyle w:val="VerbatimChar"/>
+        </w:rPr>
+        <w:t xml:space="preserve">docs_chain sync</w:t>
+      </w:r>
+      <w:r>
+        <w:t xml:space="preserve"> </w:t>
+      </w:r>
+      <w:r>
+        <w:t xml:space="preserve">— NOT</w:t>
+      </w:r>
+      <w:r>
+        <w:t xml:space="preserve"> </w:t>
+      </w:r>
+      <w:r>
+        <w:rPr>
+          <w:rStyle w:val="VerbatimChar"/>
+        </w:rPr>
+        <w:t xml:space="preserve">export_docs.sh</w:t>
+      </w:r>
+      <w:r>
+        <w:t xml:space="preserve"> </w:t>
+      </w:r>
+      <w:r>
+        <w:t xml:space="preserve">(see the staleness lesson below). Commands:</w:t>
       </w:r>
     </w:p>
     <w:p>
@@ -10503,67 +11039,28 @@
         </w:numPr>
       </w:pPr>
       <w:r>
-        <w:t xml:space="preserve">Logo source:</w:t>
-      </w:r>
-      <w:r>
-        <w:t xml:space="preserve"> </w:t>
-      </w:r>
-      <w:r>
-        <w:rPr>
-          <w:rStyle w:val="VerbatimChar"/>
-        </w:rPr>
-        <w:t xml:space="preserve">assets/logo/herald_logo.png</w:t>
-      </w:r>
-      <w:r>
-        <w:t xml:space="preserve"> </w:t>
-      </w:r>
-      <w:r>
-        <w:t xml:space="preserve">(1664x928 RGB master). Square + transparent variants live under</w:t>
-      </w:r>
-      <w:r>
-        <w:t xml:space="preserve"> </w:t>
-      </w:r>
-      <w:r>
-        <w:rPr>
-          <w:rStyle w:val="VerbatimChar"/>
-        </w:rPr>
-        <w:t xml:space="preserve">assets/logo/herald_logo_square_{32,64,128,256,512,1024}.png</w:t>
-      </w:r>
-      <w:r>
-        <w:t xml:space="preserve"> </w:t>
-      </w:r>
-      <w:r>
-        <w:t xml:space="preserve">(chroma-keyed white → alpha).</w:t>
-      </w:r>
-      <w:r>
-        <w:t xml:space="preserve"> </w:t>
-      </w:r>
-      <w:r>
-        <w:rPr>
-          <w:rStyle w:val="VerbatimChar"/>
-        </w:rPr>
-        <w:t xml:space="preserve">assets/logo/herald_logo.svg</w:t>
-      </w:r>
-      <w:r>
-        <w:t xml:space="preserve"> </w:t>
-      </w:r>
-      <w:r>
-        <w:t xml:space="preserve">is a vector wrapper around the 512px PNG.</w:t>
-      </w:r>
-      <w:r>
-        <w:t xml:space="preserve"> </w:t>
-      </w:r>
-      <w:r>
-        <w:rPr>
-          <w:rStyle w:val="VerbatimChar"/>
-        </w:rPr>
-        <w:t xml:space="preserve">assets/logo/print.css</w:t>
-      </w:r>
-      <w:r>
-        <w:t xml:space="preserve"> </w:t>
-      </w:r>
-      <w:r>
-        <w:t xml:space="preserve">carries print/screen styling for the HTML/PDF route.</w:t>
+        <w:rPr>
+          <w:rStyle w:val="VerbatimChar"/>
+        </w:rPr>
+        <w:t xml:space="preserve">docs_chain sync herald-docs</w:t>
+      </w:r>
+      <w:r>
+        <w:t xml:space="preserve"> </w:t>
+      </w:r>
+      <w:r>
+        <w:t xml:space="preserve">— regenerate the html/pdf/docx siblings via content-hashed incremental per-directory exec-wrapper transforms, atomically, updating</w:t>
+      </w:r>
+      <w:r>
+        <w:t xml:space="preserve"> </w:t>
+      </w:r>
+      <w:r>
+        <w:rPr>
+          <w:rStyle w:val="VerbatimChar"/>
+        </w:rPr>
+        <w:t xml:space="preserve">.docs_chain/state.json</w:t>
+      </w:r>
+      <w:r>
+        <w:t xml:space="preserve">. This is the routine "I edited a doc" command.</w:t>
       </w:r>
     </w:p>
     <w:p>
@@ -10575,22 +11072,68 @@
         </w:numPr>
       </w:pPr>
       <w:r>
-        <w:t xml:space="preserve">Injection: idempotent re-runnable via</w:t>
-      </w:r>
-      <w:r>
-        <w:t xml:space="preserve"> </w:t>
-      </w:r>
-      <w:r>
-        <w:rPr>
-          <w:rStyle w:val="VerbatimChar"/>
-        </w:rPr>
-        <w:t xml:space="preserve">python3 scripts/branding_inject_logo.py &lt;md ...&gt;</w:t>
-      </w:r>
-      <w:r>
-        <w:t xml:space="preserve"> </w:t>
-      </w:r>
-      <w:r>
-        <w:t xml:space="preserve">— skips submodules/, containers/, constitutable/, docs/diary/, LICENSE; respects YAML front-matter; computes the relative path per doc depth.</w:t>
+        <w:rPr>
+          <w:rStyle w:val="VerbatimChar"/>
+        </w:rPr>
+        <w:t xml:space="preserve">docs_chain verify herald-docs</w:t>
+      </w:r>
+      <w:r>
+        <w:t xml:space="preserve"> </w:t>
+      </w:r>
+      <w:r>
+        <w:t xml:space="preserve">— read-only drift gate (exit 0 +</w:t>
+      </w:r>
+      <w:r>
+        <w:t xml:space="preserve"> </w:t>
+      </w:r>
+      <w:r>
+        <w:rPr>
+          <w:rStyle w:val="VerbatimChar"/>
+        </w:rPr>
+        <w:t xml:space="preserve">in-sync</w:t>
+      </w:r>
+      <w:r>
+        <w:t xml:space="preserve">, or</w:t>
+      </w:r>
+      <w:r>
+        <w:t xml:space="preserve"> </w:t>
+      </w:r>
+      <w:r>
+        <w:rPr>
+          <w:rStyle w:val="VerbatimChar"/>
+        </w:rPr>
+        <w:t xml:space="preserve">STALE: [...]</w:t>
+      </w:r>
+      <w:r>
+        <w:t xml:space="preserve">). This is e2e invariant</w:t>
+      </w:r>
+      <w:r>
+        <w:t xml:space="preserve"> </w:t>
+      </w:r>
+      <w:r>
+        <w:rPr>
+          <w:b/>
+          <w:bCs/>
+        </w:rPr>
+        <w:t xml:space="preserve">E146</w:t>
+      </w:r>
+      <w:r>
+        <w:t xml:space="preserve"> </w:t>
+      </w:r>
+      <w:r>
+        <w:t xml:space="preserve">and the §11.4.106 drift-gate; run it before committing and confirm</w:t>
+      </w:r>
+      <w:r>
+        <w:t xml:space="preserve"> </w:t>
+      </w:r>
+      <w:r>
+        <w:rPr>
+          <w:rStyle w:val="VerbatimChar"/>
+        </w:rPr>
+        <w:t xml:space="preserve">in-sync</w:t>
+      </w:r>
+      <w:r>
+        <w:t xml:space="preserve">.</w:t>
       </w:r>
     </w:p>
     <w:p>
@@ -10602,46 +11145,16 @@
         </w:numPr>
       </w:pPr>
       <w:r>
-        <w:t xml:space="preserve">Export:</w:t>
-      </w:r>
-      <w:r>
-        <w:t xml:space="preserve"> </w:t>
-      </w:r>
-      <w:r>
-        <w:rPr>
-          <w:rStyle w:val="VerbatimChar"/>
-        </w:rPr>
-        <w:t xml:space="preserve">bash scripts/export_docs.sh [&lt;md&gt;...]</w:t>
-      </w:r>
-      <w:r>
-        <w:t xml:space="preserve"> </w:t>
-      </w:r>
-      <w:r>
-        <w:t xml:space="preserve">regenerates HTML (pandoc), PDF (</w:t>
-      </w:r>
-      <w:r>
-        <w:rPr>
-          <w:rStyle w:val="VerbatimChar"/>
-        </w:rPr>
-        <w:t xml:space="preserve">--pdf-engine=weasyprint</w:t>
-      </w:r>
-      <w:r>
-        <w:t xml:space="preserve">), DOCX (pandoc-native) for every</w:t>
-      </w:r>
-      <w:r>
-        <w:t xml:space="preserve"> </w:t>
-      </w:r>
-      <w:r>
-        <w:rPr>
-          <w:rStyle w:val="VerbatimChar"/>
-        </w:rPr>
-        <w:t xml:space="preserve">.md</w:t>
-      </w:r>
-      <w:r>
-        <w:t xml:space="preserve"> </w:t>
-      </w:r>
-      <w:r>
-        <w:t xml:space="preserve">that already has at least one sibling artefact committed. Pass no args to regenerate everything.</w:t>
+        <w:rPr>
+          <w:rStyle w:val="VerbatimChar"/>
+        </w:rPr>
+        <w:t xml:space="preserve">docs_chain doctor herald-docs</w:t>
+      </w:r>
+      <w:r>
+        <w:t xml:space="preserve"> </w:t>
+      </w:r>
+      <w:r>
+        <w:t xml:space="preserve">— validate the context graph (263 nodes, 197 edges) + that all transform tools are present.</w:t>
       </w:r>
     </w:p>
     <w:p>
@@ -10653,7 +11166,68 @@
         </w:numPr>
       </w:pPr>
       <w:r>
-        <w:t xml:space="preserve">When you add a new</w:t>
+        <w:t xml:space="preserve">Context config:</w:t>
+      </w:r>
+      <w:r>
+        <w:t xml:space="preserve"> </w:t>
+      </w:r>
+      <w:r>
+        <w:rPr>
+          <w:rStyle w:val="VerbatimChar"/>
+        </w:rPr>
+        <w:t xml:space="preserve">.docs_chain/contexts/herald-docs.yaml</w:t>
+      </w:r>
+      <w:r>
+        <w:t xml:space="preserve">, generated by</w:t>
+      </w:r>
+      <w:r>
+        <w:t xml:space="preserve"> </w:t>
+      </w:r>
+      <w:r>
+        <w:rPr>
+          <w:rStyle w:val="VerbatimChar"/>
+        </w:rPr>
+        <w:t xml:space="preserve">scripts/docs_chain/gen_context.py</w:t>
+      </w:r>
+      <w:r>
+        <w:t xml:space="preserve"> </w:t>
+      </w:r>
+      <w:r>
+        <w:t xml:space="preserve">— do</w:t>
+      </w:r>
+      <w:r>
+        <w:t xml:space="preserve"> </w:t>
+      </w:r>
+      <w:r>
+        <w:rPr>
+          <w:b/>
+          <w:bCs/>
+        </w:rPr>
+        <w:t xml:space="preserve">not</w:t>
+      </w:r>
+      <w:r>
+        <w:t xml:space="preserve"> </w:t>
+      </w:r>
+      <w:r>
+        <w:t xml:space="preserve">hand-edit it.</w:t>
+      </w:r>
+    </w:p>
+    <w:p>
+      <w:pPr>
+        <w:pStyle w:val="FirstParagraph"/>
+      </w:pPr>
+      <w:r>
+        <w:rPr>
+          <w:b/>
+          <w:bCs/>
+        </w:rPr>
+        <w:t xml:space="preserve">Staleness lesson (2026-06-02).</w:t>
+      </w:r>
+      <w:r>
+        <w:t xml:space="preserve"> </w:t>
+      </w:r>
+      <w:r>
+        <w:t xml:space="preserve">Editing a tracked</w:t>
       </w:r>
       <w:r>
         <w:t xml:space="preserve"> </w:t>
@@ -10665,17 +11239,217 @@
         <w:t xml:space="preserve">.md</w:t>
       </w:r>
       <w:r>
-        <w:t xml:space="preserve">, run the injector once; when you edit one whose sibling exports are tracked, run the exporter for that one file.</w:t>
-      </w:r>
-    </w:p>
-    <w:bookmarkEnd w:id="46"/>
-    <w:bookmarkStart w:id="47" w:name="notes-for-future-scaffolding"/>
-    <w:p>
-      <w:pPr>
-        <w:pStyle w:val="Heading2"/>
-      </w:pPr>
-      <w:r>
-        <w:t xml:space="preserve">Notes for future scaffolding</w:t>
+        <w:t xml:space="preserve"> </w:t>
+      </w:r>
+      <w:r>
+        <w:t xml:space="preserve">and regenerating with</w:t>
+      </w:r>
+      <w:r>
+        <w:t xml:space="preserve"> </w:t>
+      </w:r>
+      <w:r>
+        <w:rPr>
+          <w:rStyle w:val="VerbatimChar"/>
+        </w:rPr>
+        <w:t xml:space="preserve">scripts/export_docs.sh</w:t>
+      </w:r>
+      <w:r>
+        <w:t xml:space="preserve"> </w:t>
+      </w:r>
+      <w:r>
+        <w:t xml:space="preserve">can leave docx/pdf siblings that</w:t>
+      </w:r>
+      <w:r>
+        <w:t xml:space="preserve"> </w:t>
+      </w:r>
+      <w:r>
+        <w:rPr>
+          <w:rStyle w:val="VerbatimChar"/>
+        </w:rPr>
+        <w:t xml:space="preserve">docs_chain verify</w:t>
+      </w:r>
+      <w:r>
+        <w:t xml:space="preserve"> </w:t>
+      </w:r>
+      <w:r>
+        <w:t xml:space="preserve">flags STALE (export_docs.sh produces byte-identical HTML, but its docx/pdf can drift from the docs_chain canonical output). So after editing tracked docs, run</w:t>
+      </w:r>
+      <w:r>
+        <w:t xml:space="preserve"> </w:t>
+      </w:r>
+      <w:r>
+        <w:rPr>
+          <w:rStyle w:val="VerbatimChar"/>
+        </w:rPr>
+        <w:t xml:space="preserve">docs_chain sync herald-docs</w:t>
+      </w:r>
+      <w:r>
+        <w:t xml:space="preserve"> </w:t>
+      </w:r>
+      <w:r>
+        <w:t xml:space="preserve">and confirm</w:t>
+      </w:r>
+      <w:r>
+        <w:t xml:space="preserve"> </w:t>
+      </w:r>
+      <w:r>
+        <w:rPr>
+          <w:rStyle w:val="VerbatimChar"/>
+        </w:rPr>
+        <w:t xml:space="preserve">docs_chain verify herald-docs</w:t>
+      </w:r>
+      <w:r>
+        <w:t xml:space="preserve"> </w:t>
+      </w:r>
+      <w:r>
+        <w:t xml:space="preserve">is</w:t>
+      </w:r>
+      <w:r>
+        <w:t xml:space="preserve"> </w:t>
+      </w:r>
+      <w:r>
+        <w:rPr>
+          <w:rStyle w:val="VerbatimChar"/>
+        </w:rPr>
+        <w:t xml:space="preserve">in-sync</w:t>
+      </w:r>
+      <w:r>
+        <w:t xml:space="preserve"> </w:t>
+      </w:r>
+      <w:r>
+        <w:t xml:space="preserve">BEFORE committing.</w:t>
+      </w:r>
+      <w:r>
+        <w:t xml:space="preserve"> </w:t>
+      </w:r>
+      <w:r>
+        <w:rPr>
+          <w:rStyle w:val="VerbatimChar"/>
+        </w:rPr>
+        <w:t xml:space="preserve">scripts/export_docs.sh</w:t>
+      </w:r>
+      <w:r>
+        <w:t xml:space="preserve"> </w:t>
+      </w:r>
+      <w:r>
+        <w:t xml:space="preserve">REMAINS a valid fallback when</w:t>
+      </w:r>
+      <w:r>
+        <w:t xml:space="preserve"> </w:t>
+      </w:r>
+      <w:r>
+        <w:rPr>
+          <w:rStyle w:val="VerbatimChar"/>
+        </w:rPr>
+        <w:t xml:space="preserve">docs_chain</w:t>
+      </w:r>
+      <w:r>
+        <w:t xml:space="preserve"> </w:t>
+      </w:r>
+      <w:r>
+        <w:t xml:space="preserve">is unavailable, but PREFER</w:t>
+      </w:r>
+      <w:r>
+        <w:t xml:space="preserve"> </w:t>
+      </w:r>
+      <w:r>
+        <w:rPr>
+          <w:rStyle w:val="VerbatimChar"/>
+        </w:rPr>
+        <w:t xml:space="preserve">docs_chain sync</w:t>
+      </w:r>
+      <w:r>
+        <w:t xml:space="preserve">.</w:t>
+      </w:r>
+    </w:p>
+    <w:p>
+      <w:pPr>
+        <w:pStyle w:val="BodyText"/>
+      </w:pPr>
+      <w:r>
+        <w:rPr>
+          <w:b/>
+          <w:bCs/>
+        </w:rPr>
+        <w:t xml:space="preserve">Logo branding (added 2026-05-21).</w:t>
+      </w:r>
+      <w:r>
+        <w:t xml:space="preserve"> </w:t>
+      </w:r>
+      <w:r>
+        <w:t xml:space="preserve">Every tracked Markdown doc now leads with a centered Herald logo header (pandoc-friendly</w:t>
+      </w:r>
+      <w:r>
+        <w:t xml:space="preserve"> </w:t>
+      </w:r>
+      <w:r>
+        <w:rPr>
+          <w:rStyle w:val="VerbatimChar"/>
+        </w:rPr>
+        <w:t xml:space="preserve">&lt;div align="center"&gt;</w:t>
+      </w:r>
+      <w:r>
+        <w:t xml:space="preserve"> </w:t>
+      </w:r>
+      <w:r>
+        <w:t xml:space="preserve">wrapping a</w:t>
+      </w:r>
+      <w:r>
+        <w:t xml:space="preserve"> </w:t>
+      </w:r>
+      <w:r>
+        <w:rPr>
+          <w:rStyle w:val="VerbatimChar"/>
+        </w:rPr>
+        <w:t xml:space="preserve">&lt;img src="..." alt="Herald" width="96" height="96" /&gt;</w:t>
+      </w:r>
+      <w:r>
+        <w:t xml:space="preserve"> </w:t>
+      </w:r>
+      <w:r>
+        <w:t xml:space="preserve">image reference to</w:t>
+      </w:r>
+      <w:r>
+        <w:t xml:space="preserve"> </w:t>
+      </w:r>
+      <w:r>
+        <w:rPr>
+          <w:rStyle w:val="VerbatimChar"/>
+        </w:rPr>
+        <w:t xml:space="preserve">assets/logo/herald_logo_square_128.png</w:t>
+      </w:r>
+      <w:r>
+        <w:t xml:space="preserve">). The export pipeline (both</w:t>
+      </w:r>
+      <w:r>
+        <w:t xml:space="preserve"> </w:t>
+      </w:r>
+      <w:r>
+        <w:rPr>
+          <w:rStyle w:val="VerbatimChar"/>
+        </w:rPr>
+        <w:t xml:space="preserve">docs_chain</w:t>
+      </w:r>
+      <w:r>
+        <w:t xml:space="preserve"> </w:t>
+      </w:r>
+      <w:r>
+        <w:t xml:space="preserve">and the</w:t>
+      </w:r>
+      <w:r>
+        <w:t xml:space="preserve"> </w:t>
+      </w:r>
+      <w:r>
+        <w:rPr>
+          <w:rStyle w:val="VerbatimChar"/>
+        </w:rPr>
+        <w:t xml:space="preserve">export_docs.sh</w:t>
+      </w:r>
+      <w:r>
+        <w:t xml:space="preserve"> </w:t>
+      </w:r>
+      <w:r>
+        <w:t xml:space="preserve">fallback) propagates that logo into the HTML, PDF, and DOCX siblings:</w:t>
       </w:r>
     </w:p>
     <w:p>
@@ -10687,239 +11461,67 @@
         </w:numPr>
       </w:pPr>
       <w:r>
-        <w:rPr>
-          <w:rStyle w:val="VerbatimChar"/>
-        </w:rPr>
-        <w:t xml:space="preserve">submodules/</w:t>
-      </w:r>
-      <w:r>
-        <w:t xml:space="preserve"> </w:t>
-      </w:r>
-      <w:r>
-        <w:t xml:space="preserve">holds 9 vendored Helix-stack modules (each its own</w:t>
-      </w:r>
-      <w:r>
-        <w:t xml:space="preserve"> </w:t>
-      </w:r>
-      <w:r>
-        <w:rPr>
-          <w:rStyle w:val="VerbatimChar"/>
-        </w:rPr>
-        <w:t xml:space="preserve">git@github.com:vasic-digital/&lt;name&gt;.git</w:t>
-      </w:r>
-      <w:r>
-        <w:t xml:space="preserve"> </w:t>
-      </w:r>
-      <w:r>
-        <w:t xml:space="preserve">repo):</w:t>
-      </w:r>
-      <w:r>
-        <w:t xml:space="preserve"> </w:t>
-      </w:r>
-      <w:r>
-        <w:rPr>
-          <w:rStyle w:val="VerbatimChar"/>
-        </w:rPr>
-        <w:t xml:space="preserve">auth</w:t>
-      </w:r>
-      <w:r>
-        <w:t xml:space="preserve">,</w:t>
-      </w:r>
-      <w:r>
-        <w:t xml:space="preserve"> </w:t>
-      </w:r>
-      <w:r>
-        <w:rPr>
-          <w:rStyle w:val="VerbatimChar"/>
-        </w:rPr>
-        <w:t xml:space="preserve">background</w:t>
-      </w:r>
-      <w:r>
-        <w:t xml:space="preserve">,</w:t>
-      </w:r>
-      <w:r>
-        <w:t xml:space="preserve"> </w:t>
-      </w:r>
-      <w:r>
-        <w:rPr>
-          <w:rStyle w:val="VerbatimChar"/>
-        </w:rPr>
-        <w:t xml:space="preserve">cache</w:t>
-      </w:r>
-      <w:r>
-        <w:t xml:space="preserve">,</w:t>
-      </w:r>
-      <w:r>
-        <w:t xml:space="preserve"> </w:t>
-      </w:r>
-      <w:r>
-        <w:rPr>
-          <w:rStyle w:val="VerbatimChar"/>
-        </w:rPr>
-        <w:t xml:space="preserve">config</w:t>
-      </w:r>
-      <w:r>
-        <w:t xml:space="preserve">,</w:t>
-      </w:r>
-      <w:r>
-        <w:t xml:space="preserve"> </w:t>
-      </w:r>
-      <w:r>
-        <w:rPr>
-          <w:rStyle w:val="VerbatimChar"/>
-        </w:rPr>
-        <w:t xml:space="preserve">database</w:t>
-      </w:r>
-      <w:r>
-        <w:t xml:space="preserve">,</w:t>
-      </w:r>
-      <w:r>
-        <w:t xml:space="preserve"> </w:t>
-      </w:r>
-      <w:r>
-        <w:rPr>
-          <w:rStyle w:val="VerbatimChar"/>
-        </w:rPr>
-        <w:t xml:space="preserve">eventbus</w:t>
-      </w:r>
-      <w:r>
-        <w:t xml:space="preserve">,</w:t>
-      </w:r>
-      <w:r>
-        <w:t xml:space="preserve"> </w:t>
-      </w:r>
-      <w:r>
-        <w:rPr>
-          <w:rStyle w:val="VerbatimChar"/>
-        </w:rPr>
-        <w:t xml:space="preserve">middleware</w:t>
-      </w:r>
-      <w:r>
-        <w:t xml:space="preserve">,</w:t>
-      </w:r>
-      <w:r>
-        <w:t xml:space="preserve"> </w:t>
-      </w:r>
-      <w:r>
-        <w:rPr>
-          <w:rStyle w:val="VerbatimChar"/>
-        </w:rPr>
-        <w:t xml:space="preserve">observability</w:t>
-      </w:r>
-      <w:r>
-        <w:t xml:space="preserve">,</w:t>
-      </w:r>
-      <w:r>
-        <w:t xml:space="preserve"> </w:t>
-      </w:r>
-      <w:r>
-        <w:rPr>
-          <w:rStyle w:val="VerbatimChar"/>
-        </w:rPr>
-        <w:t xml:space="preserve">recovery</w:t>
-      </w:r>
-      <w:r>
-        <w:t xml:space="preserve">. They are referenced via</w:t>
-      </w:r>
-      <w:r>
-        <w:t xml:space="preserve"> </w:t>
-      </w:r>
-      <w:r>
-        <w:rPr>
-          <w:rStyle w:val="VerbatimChar"/>
-        </w:rPr>
-        <w:t xml:space="preserve">replace</w:t>
-      </w:r>
-      <w:r>
-        <w:t xml:space="preserve"> </w:t>
-      </w:r>
-      <w:r>
-        <w:t xml:space="preserve">directives in the consuming Herald modules'</w:t>
-      </w:r>
-      <w:r>
-        <w:t xml:space="preserve"> </w:t>
-      </w:r>
-      <w:r>
-        <w:rPr>
-          <w:rStyle w:val="VerbatimChar"/>
-        </w:rPr>
-        <w:t xml:space="preserve">go.mod</w:t>
-      </w:r>
-      <w:r>
-        <w:t xml:space="preserve">, NOT via</w:t>
-      </w:r>
-      <w:r>
-        <w:t xml:space="preserve"> </w:t>
-      </w:r>
-      <w:r>
-        <w:rPr>
-          <w:rStyle w:val="VerbatimChar"/>
-        </w:rPr>
-        <w:t xml:space="preserve">go.work</w:t>
-      </w:r>
-      <w:r>
-        <w:t xml:space="preserve"> </w:t>
-      </w:r>
-      <w:r>
-        <w:t xml:space="preserve">(which lists the</w:t>
-      </w:r>
-      <w:r>
-        <w:t xml:space="preserve"> </w:t>
-      </w:r>
-      <w:r>
-        <w:rPr>
-          <w:b/>
-          <w:bCs/>
-        </w:rPr>
-        <w:t xml:space="preserve">18</w:t>
-      </w:r>
-      <w:r>
-        <w:t xml:space="preserve"> </w:t>
-      </w:r>
-      <w:r>
-        <w:t xml:space="preserve">Herald-owned modules — 10 shared/foundation incl.</w:t>
-      </w:r>
-      <w:r>
-        <w:t xml:space="preserve"> </w:t>
-      </w:r>
-      <w:r>
-        <w:rPr>
-          <w:rStyle w:val="VerbatimChar"/>
-        </w:rPr>
-        <w:t xml:space="preserve">commons_watch</w:t>
-      </w:r>
-      <w:r>
-        <w:t xml:space="preserve"> </w:t>
-      </w:r>
-      <w:r>
-        <w:t xml:space="preserve">+</w:t>
-      </w:r>
-      <w:r>
-        <w:t xml:space="preserve"> </w:t>
-      </w:r>
-      <w:r>
-        <w:rPr>
-          <w:rStyle w:val="VerbatimChar"/>
-        </w:rPr>
-        <w:t xml:space="preserve">commons_workable</w:t>
-      </w:r>
-      <w:r>
-        <w:t xml:space="preserve"> </w:t>
-      </w:r>
-      <w:r>
-        <w:t xml:space="preserve">+ 8 flavor binaries). Do not add the Helix-stack submodules to</w:t>
-      </w:r>
-      <w:r>
-        <w:t xml:space="preserve"> </w:t>
-      </w:r>
-      <w:r>
-        <w:rPr>
-          <w:rStyle w:val="VerbatimChar"/>
-        </w:rPr>
-        <w:t xml:space="preserve">go.work</w:t>
-      </w:r>
-      <w:r>
-        <w:t xml:space="preserve">.</w:t>
+        <w:t xml:space="preserve">Logo source:</w:t>
+      </w:r>
+      <w:r>
+        <w:t xml:space="preserve"> </w:t>
+      </w:r>
+      <w:r>
+        <w:rPr>
+          <w:rStyle w:val="VerbatimChar"/>
+        </w:rPr>
+        <w:t xml:space="preserve">assets/logo/herald_logo.png</w:t>
+      </w:r>
+      <w:r>
+        <w:t xml:space="preserve"> </w:t>
+      </w:r>
+      <w:r>
+        <w:t xml:space="preserve">(1664x928 RGB master). Square + transparent variants live under</w:t>
+      </w:r>
+      <w:r>
+        <w:t xml:space="preserve"> </w:t>
+      </w:r>
+      <w:r>
+        <w:rPr>
+          <w:rStyle w:val="VerbatimChar"/>
+        </w:rPr>
+        <w:t xml:space="preserve">assets/logo/herald_logo_square_{32,64,128,256,512,1024}.png</w:t>
+      </w:r>
+      <w:r>
+        <w:t xml:space="preserve"> </w:t>
+      </w:r>
+      <w:r>
+        <w:t xml:space="preserve">(chroma-keyed white → alpha).</w:t>
+      </w:r>
+      <w:r>
+        <w:t xml:space="preserve"> </w:t>
+      </w:r>
+      <w:r>
+        <w:rPr>
+          <w:rStyle w:val="VerbatimChar"/>
+        </w:rPr>
+        <w:t xml:space="preserve">assets/logo/herald_logo.svg</w:t>
+      </w:r>
+      <w:r>
+        <w:t xml:space="preserve"> </w:t>
+      </w:r>
+      <w:r>
+        <w:t xml:space="preserve">is a vector wrapper around the 512px PNG.</w:t>
+      </w:r>
+      <w:r>
+        <w:t xml:space="preserve"> </w:t>
+      </w:r>
+      <w:r>
+        <w:rPr>
+          <w:rStyle w:val="VerbatimChar"/>
+        </w:rPr>
+        <w:t xml:space="preserve">assets/logo/print.css</w:t>
+      </w:r>
+      <w:r>
+        <w:t xml:space="preserve"> </w:t>
+      </w:r>
+      <w:r>
+        <w:t xml:space="preserve">carries print/screen styling for the HTML/PDF route.</w:t>
       </w:r>
     </w:p>
     <w:p>
@@ -10931,22 +11533,22 @@
         </w:numPr>
       </w:pPr>
       <w:r>
-        <w:t xml:space="preserve">The repo is in</w:t>
-      </w:r>
-      <w:r>
-        <w:t xml:space="preserve"> </w:t>
-      </w:r>
-      <w:r>
-        <w:rPr>
-          <w:rStyle w:val="VerbatimChar"/>
-        </w:rPr>
-        <w:t xml:space="preserve">main</w:t>
-      </w:r>
-      <w:r>
-        <w:t xml:space="preserve"> </w:t>
-      </w:r>
-      <w:r>
-        <w:t xml:space="preserve">branch and committed under "Milos Vasic" — no other contributors yet.</w:t>
+        <w:t xml:space="preserve">Injection: idempotent re-runnable via</w:t>
+      </w:r>
+      <w:r>
+        <w:t xml:space="preserve"> </w:t>
+      </w:r>
+      <w:r>
+        <w:rPr>
+          <w:rStyle w:val="VerbatimChar"/>
+        </w:rPr>
+        <w:t xml:space="preserve">python3 scripts/branding_inject_logo.py &lt;md ...&gt;</w:t>
+      </w:r>
+      <w:r>
+        <w:t xml:space="preserve"> </w:t>
+      </w:r>
+      <w:r>
+        <w:t xml:space="preserve">— skips submodules/, containers/, constitutable/, docs/diary/, LICENSE; respects YAML front-matter; computes the relative path per doc depth.</w:t>
       </w:r>
     </w:p>
     <w:p>
@@ -10958,16 +11560,61 @@
         </w:numPr>
       </w:pPr>
       <w:r>
-        <w:rPr>
-          <w:rStyle w:val="VerbatimChar"/>
-        </w:rPr>
-        <w:t xml:space="preserve">.claude/</w:t>
-      </w:r>
-      <w:r>
-        <w:t xml:space="preserve"> </w:t>
-      </w:r>
-      <w:r>
-        <w:t xml:space="preserve">exists but is empty; project-local Claude config can go there.</w:t>
+        <w:t xml:space="preserve">Export (fallback):</w:t>
+      </w:r>
+      <w:r>
+        <w:t xml:space="preserve"> </w:t>
+      </w:r>
+      <w:r>
+        <w:rPr>
+          <w:rStyle w:val="VerbatimChar"/>
+        </w:rPr>
+        <w:t xml:space="preserve">bash scripts/export_docs.sh [&lt;md&gt;...]</w:t>
+      </w:r>
+      <w:r>
+        <w:t xml:space="preserve"> </w:t>
+      </w:r>
+      <w:r>
+        <w:t xml:space="preserve">regenerates HTML (pandoc), PDF (</w:t>
+      </w:r>
+      <w:r>
+        <w:rPr>
+          <w:rStyle w:val="VerbatimChar"/>
+        </w:rPr>
+        <w:t xml:space="preserve">--pdf-engine=weasyprint</w:t>
+      </w:r>
+      <w:r>
+        <w:t xml:space="preserve">), DOCX (pandoc-native) for every</w:t>
+      </w:r>
+      <w:r>
+        <w:t xml:space="preserve"> </w:t>
+      </w:r>
+      <w:r>
+        <w:rPr>
+          <w:rStyle w:val="VerbatimChar"/>
+        </w:rPr>
+        <w:t xml:space="preserve">.md</w:t>
+      </w:r>
+      <w:r>
+        <w:t xml:space="preserve"> </w:t>
+      </w:r>
+      <w:r>
+        <w:t xml:space="preserve">that already has at least one sibling artefact committed. Pass no args to regenerate everything. PREFER</w:t>
+      </w:r>
+      <w:r>
+        <w:t xml:space="preserve"> </w:t>
+      </w:r>
+      <w:r>
+        <w:rPr>
+          <w:rStyle w:val="VerbatimChar"/>
+        </w:rPr>
+        <w:t xml:space="preserve">docs_chain sync herald-docs</w:t>
+      </w:r>
+      <w:r>
+        <w:t xml:space="preserve"> </w:t>
+      </w:r>
+      <w:r>
+        <w:t xml:space="preserve">per the staleness lesson above.</w:t>
       </w:r>
     </w:p>
     <w:p>
@@ -10979,16 +11626,44 @@
         </w:numPr>
       </w:pPr>
       <w:r>
-        <w:rPr>
-          <w:rStyle w:val="VerbatimChar"/>
-        </w:rPr>
-        <w:t xml:space="preserve">LICENSE</w:t>
-      </w:r>
-      <w:r>
-        <w:t xml:space="preserve"> </w:t>
-      </w:r>
-      <w:r>
-        <w:t xml:space="preserve">is present (do not overwrite without asking).</w:t>
+        <w:t xml:space="preserve">When you add a new</w:t>
+      </w:r>
+      <w:r>
+        <w:t xml:space="preserve"> </w:t>
+      </w:r>
+      <w:r>
+        <w:rPr>
+          <w:rStyle w:val="VerbatimChar"/>
+        </w:rPr>
+        <w:t xml:space="preserve">.md</w:t>
+      </w:r>
+      <w:r>
+        <w:t xml:space="preserve">, run the injector once; when you edit one whose sibling exports are tracked, run</w:t>
+      </w:r>
+      <w:r>
+        <w:t xml:space="preserve"> </w:t>
+      </w:r>
+      <w:r>
+        <w:rPr>
+          <w:rStyle w:val="VerbatimChar"/>
+        </w:rPr>
+        <w:t xml:space="preserve">docs_chain sync herald-docs</w:t>
+      </w:r>
+      <w:r>
+        <w:t xml:space="preserve"> </w:t>
+      </w:r>
+      <w:r>
+        <w:t xml:space="preserve">(fallback: the exporter for that one file).</w:t>
+      </w:r>
+    </w:p>
+    <w:bookmarkEnd w:id="46"/>
+    <w:bookmarkStart w:id="47" w:name="notes-for-future-scaffolding"/>
+    <w:p>
+      <w:pPr>
+        <w:pStyle w:val="Heading2"/>
+      </w:pPr>
+      <w:r>
+        <w:t xml:space="preserve">Notes for future scaffolding</w:t>
       </w:r>
     </w:p>
     <w:p>
@@ -10996,7 +11671,320 @@
         <w:pStyle w:val="Compact"/>
         <w:numPr>
           <w:ilvl w:val="0"/>
-          <w:numId w:val="1012"/>
+          <w:numId w:val="1013"/>
+        </w:numPr>
+      </w:pPr>
+      <w:r>
+        <w:rPr>
+          <w:rStyle w:val="VerbatimChar"/>
+        </w:rPr>
+        <w:t xml:space="preserve">submodules/</w:t>
+      </w:r>
+      <w:r>
+        <w:t xml:space="preserve"> </w:t>
+      </w:r>
+      <w:r>
+        <w:t xml:space="preserve">holds 9 vendored Helix-stack modules (each its own</w:t>
+      </w:r>
+      <w:r>
+        <w:t xml:space="preserve"> </w:t>
+      </w:r>
+      <w:r>
+        <w:rPr>
+          <w:rStyle w:val="VerbatimChar"/>
+        </w:rPr>
+        <w:t xml:space="preserve">git@github.com:vasic-digital/&lt;name&gt;.git</w:t>
+      </w:r>
+      <w:r>
+        <w:t xml:space="preserve"> </w:t>
+      </w:r>
+      <w:r>
+        <w:t xml:space="preserve">repo):</w:t>
+      </w:r>
+      <w:r>
+        <w:t xml:space="preserve"> </w:t>
+      </w:r>
+      <w:r>
+        <w:rPr>
+          <w:rStyle w:val="VerbatimChar"/>
+        </w:rPr>
+        <w:t xml:space="preserve">auth</w:t>
+      </w:r>
+      <w:r>
+        <w:t xml:space="preserve">,</w:t>
+      </w:r>
+      <w:r>
+        <w:t xml:space="preserve"> </w:t>
+      </w:r>
+      <w:r>
+        <w:rPr>
+          <w:rStyle w:val="VerbatimChar"/>
+        </w:rPr>
+        <w:t xml:space="preserve">background</w:t>
+      </w:r>
+      <w:r>
+        <w:t xml:space="preserve">,</w:t>
+      </w:r>
+      <w:r>
+        <w:t xml:space="preserve"> </w:t>
+      </w:r>
+      <w:r>
+        <w:rPr>
+          <w:rStyle w:val="VerbatimChar"/>
+        </w:rPr>
+        <w:t xml:space="preserve">cache</w:t>
+      </w:r>
+      <w:r>
+        <w:t xml:space="preserve">,</w:t>
+      </w:r>
+      <w:r>
+        <w:t xml:space="preserve"> </w:t>
+      </w:r>
+      <w:r>
+        <w:rPr>
+          <w:rStyle w:val="VerbatimChar"/>
+        </w:rPr>
+        <w:t xml:space="preserve">config</w:t>
+      </w:r>
+      <w:r>
+        <w:t xml:space="preserve">,</w:t>
+      </w:r>
+      <w:r>
+        <w:t xml:space="preserve"> </w:t>
+      </w:r>
+      <w:r>
+        <w:rPr>
+          <w:rStyle w:val="VerbatimChar"/>
+        </w:rPr>
+        <w:t xml:space="preserve">database</w:t>
+      </w:r>
+      <w:r>
+        <w:t xml:space="preserve">,</w:t>
+      </w:r>
+      <w:r>
+        <w:t xml:space="preserve"> </w:t>
+      </w:r>
+      <w:r>
+        <w:rPr>
+          <w:rStyle w:val="VerbatimChar"/>
+        </w:rPr>
+        <w:t xml:space="preserve">eventbus</w:t>
+      </w:r>
+      <w:r>
+        <w:t xml:space="preserve">,</w:t>
+      </w:r>
+      <w:r>
+        <w:t xml:space="preserve"> </w:t>
+      </w:r>
+      <w:r>
+        <w:rPr>
+          <w:rStyle w:val="VerbatimChar"/>
+        </w:rPr>
+        <w:t xml:space="preserve">middleware</w:t>
+      </w:r>
+      <w:r>
+        <w:t xml:space="preserve">,</w:t>
+      </w:r>
+      <w:r>
+        <w:t xml:space="preserve"> </w:t>
+      </w:r>
+      <w:r>
+        <w:rPr>
+          <w:rStyle w:val="VerbatimChar"/>
+        </w:rPr>
+        <w:t xml:space="preserve">observability</w:t>
+      </w:r>
+      <w:r>
+        <w:t xml:space="preserve">,</w:t>
+      </w:r>
+      <w:r>
+        <w:t xml:space="preserve"> </w:t>
+      </w:r>
+      <w:r>
+        <w:rPr>
+          <w:rStyle w:val="VerbatimChar"/>
+        </w:rPr>
+        <w:t xml:space="preserve">recovery</w:t>
+      </w:r>
+      <w:r>
+        <w:t xml:space="preserve">. They are referenced via</w:t>
+      </w:r>
+      <w:r>
+        <w:t xml:space="preserve"> </w:t>
+      </w:r>
+      <w:r>
+        <w:rPr>
+          <w:rStyle w:val="VerbatimChar"/>
+        </w:rPr>
+        <w:t xml:space="preserve">replace</w:t>
+      </w:r>
+      <w:r>
+        <w:t xml:space="preserve"> </w:t>
+      </w:r>
+      <w:r>
+        <w:t xml:space="preserve">directives in the consuming Herald modules'</w:t>
+      </w:r>
+      <w:r>
+        <w:t xml:space="preserve"> </w:t>
+      </w:r>
+      <w:r>
+        <w:rPr>
+          <w:rStyle w:val="VerbatimChar"/>
+        </w:rPr>
+        <w:t xml:space="preserve">go.mod</w:t>
+      </w:r>
+      <w:r>
+        <w:t xml:space="preserve">, NOT via</w:t>
+      </w:r>
+      <w:r>
+        <w:t xml:space="preserve"> </w:t>
+      </w:r>
+      <w:r>
+        <w:rPr>
+          <w:rStyle w:val="VerbatimChar"/>
+        </w:rPr>
+        <w:t xml:space="preserve">go.work</w:t>
+      </w:r>
+      <w:r>
+        <w:t xml:space="preserve"> </w:t>
+      </w:r>
+      <w:r>
+        <w:t xml:space="preserve">(which lists the</w:t>
+      </w:r>
+      <w:r>
+        <w:t xml:space="preserve"> </w:t>
+      </w:r>
+      <w:r>
+        <w:rPr>
+          <w:b/>
+          <w:bCs/>
+        </w:rPr>
+        <w:t xml:space="preserve">18</w:t>
+      </w:r>
+      <w:r>
+        <w:t xml:space="preserve"> </w:t>
+      </w:r>
+      <w:r>
+        <w:t xml:space="preserve">Herald-owned modules — 10 shared/foundation incl.</w:t>
+      </w:r>
+      <w:r>
+        <w:t xml:space="preserve"> </w:t>
+      </w:r>
+      <w:r>
+        <w:rPr>
+          <w:rStyle w:val="VerbatimChar"/>
+        </w:rPr>
+        <w:t xml:space="preserve">commons_watch</w:t>
+      </w:r>
+      <w:r>
+        <w:t xml:space="preserve"> </w:t>
+      </w:r>
+      <w:r>
+        <w:t xml:space="preserve">+</w:t>
+      </w:r>
+      <w:r>
+        <w:t xml:space="preserve"> </w:t>
+      </w:r>
+      <w:r>
+        <w:rPr>
+          <w:rStyle w:val="VerbatimChar"/>
+        </w:rPr>
+        <w:t xml:space="preserve">commons_workable</w:t>
+      </w:r>
+      <w:r>
+        <w:t xml:space="preserve"> </w:t>
+      </w:r>
+      <w:r>
+        <w:t xml:space="preserve">+ 8 flavor binaries). Do not add the Helix-stack submodules to</w:t>
+      </w:r>
+      <w:r>
+        <w:t xml:space="preserve"> </w:t>
+      </w:r>
+      <w:r>
+        <w:rPr>
+          <w:rStyle w:val="VerbatimChar"/>
+        </w:rPr>
+        <w:t xml:space="preserve">go.work</w:t>
+      </w:r>
+      <w:r>
+        <w:t xml:space="preserve">.</w:t>
+      </w:r>
+    </w:p>
+    <w:p>
+      <w:pPr>
+        <w:pStyle w:val="Compact"/>
+        <w:numPr>
+          <w:ilvl w:val="0"/>
+          <w:numId w:val="1013"/>
+        </w:numPr>
+      </w:pPr>
+      <w:r>
+        <w:t xml:space="preserve">The repo is in</w:t>
+      </w:r>
+      <w:r>
+        <w:t xml:space="preserve"> </w:t>
+      </w:r>
+      <w:r>
+        <w:rPr>
+          <w:rStyle w:val="VerbatimChar"/>
+        </w:rPr>
+        <w:t xml:space="preserve">main</w:t>
+      </w:r>
+      <w:r>
+        <w:t xml:space="preserve"> </w:t>
+      </w:r>
+      <w:r>
+        <w:t xml:space="preserve">branch and committed under "Milos Vasic" — no other contributors yet.</w:t>
+      </w:r>
+    </w:p>
+    <w:p>
+      <w:pPr>
+        <w:pStyle w:val="Compact"/>
+        <w:numPr>
+          <w:ilvl w:val="0"/>
+          <w:numId w:val="1013"/>
+        </w:numPr>
+      </w:pPr>
+      <w:r>
+        <w:rPr>
+          <w:rStyle w:val="VerbatimChar"/>
+        </w:rPr>
+        <w:t xml:space="preserve">.claude/</w:t>
+      </w:r>
+      <w:r>
+        <w:t xml:space="preserve"> </w:t>
+      </w:r>
+      <w:r>
+        <w:t xml:space="preserve">exists but is empty; project-local Claude config can go there.</w:t>
+      </w:r>
+    </w:p>
+    <w:p>
+      <w:pPr>
+        <w:pStyle w:val="Compact"/>
+        <w:numPr>
+          <w:ilvl w:val="0"/>
+          <w:numId w:val="1013"/>
+        </w:numPr>
+      </w:pPr>
+      <w:r>
+        <w:rPr>
+          <w:rStyle w:val="VerbatimChar"/>
+        </w:rPr>
+        <w:t xml:space="preserve">LICENSE</w:t>
+      </w:r>
+      <w:r>
+        <w:t xml:space="preserve"> </w:t>
+      </w:r>
+      <w:r>
+        <w:t xml:space="preserve">is present (do not overwrite without asking).</w:t>
+      </w:r>
+    </w:p>
+    <w:p>
+      <w:pPr>
+        <w:pStyle w:val="Compact"/>
+        <w:numPr>
+          <w:ilvl w:val="0"/>
+          <w:numId w:val="1013"/>
         </w:numPr>
       </w:pPr>
       <w:r>
@@ -11403,6 +12391,9 @@
     <w:abstractNumId w:val="991"/>
   </w:num>
   <w:num w:numId="1012">
+    <w:abstractNumId w:val="991"/>
+  </w:num>
+  <w:num w:numId="1013">
     <w:abstractNumId w:val="991"/>
   </w:num>
 </w:numbering>

</xml_diff>